<commit_message>
Word files: fix right-to-left alignment (text was hugging the left); add the approved payment-request form as an editable Word template
Co-Authored-By: Claude Sonnet 5.5 <noreply@anthropic.com>
Claude-Session: https://claude.ai/code/session_01SHGXLMzTpjgSYCYG6UniWT
</commit_message>
<xml_diff>
--- a/po_web/docs/خطة_التشغيل_المتوازي.docx
+++ b/po_web/docs/خطة_التشغيل_المتوازي.docx
@@ -89,7 +89,7 @@
         <w:keepNext/>
         <w:bidi/>
         <w:spacing w:after="160" w:before="280"/>
-        <w:jc w:val="right"/>
+        <w:jc w:val="left"/>
       </w:pPr>
       <w:r>
         <w:rPr>
@@ -108,7 +108,7 @@
       <w:pPr>
         <w:bidi/>
         <w:spacing w:after="120"/>
-        <w:jc w:val="right"/>
+        <w:jc w:val="left"/>
       </w:pPr>
       <w:r>
         <w:rPr>
@@ -126,7 +126,7 @@
         <w:keepNext/>
         <w:bidi/>
         <w:spacing w:after="160" w:before="280"/>
-        <w:jc w:val="right"/>
+        <w:jc w:val="left"/>
       </w:pPr>
       <w:r>
         <w:rPr>
@@ -166,7 +166,7 @@
           <w:p>
             <w:pPr>
               <w:bidi/>
-              <w:jc w:val="right"/>
+              <w:jc w:val="left"/>
             </w:pPr>
             <w:r>
               <w:rPr>
@@ -190,7 +190,7 @@
           <w:p>
             <w:pPr>
               <w:bidi/>
-              <w:jc w:val="right"/>
+              <w:jc w:val="left"/>
             </w:pPr>
             <w:r>
               <w:rPr>
@@ -214,7 +214,7 @@
           <w:p>
             <w:pPr>
               <w:bidi/>
-              <w:jc w:val="right"/>
+              <w:jc w:val="left"/>
             </w:pPr>
             <w:r>
               <w:rPr>
@@ -238,7 +238,7 @@
           <w:p>
             <w:pPr>
               <w:bidi/>
-              <w:jc w:val="right"/>
+              <w:jc w:val="left"/>
             </w:pPr>
             <w:r>
               <w:rPr>
@@ -263,7 +263,7 @@
           <w:p>
             <w:pPr>
               <w:bidi/>
-              <w:jc w:val="right"/>
+              <w:jc w:val="left"/>
             </w:pPr>
             <w:r>
               <w:rPr>
@@ -283,7 +283,7 @@
           <w:p>
             <w:pPr>
               <w:bidi/>
-              <w:jc w:val="right"/>
+              <w:jc w:val="left"/>
             </w:pPr>
             <w:r>
               <w:rPr>
@@ -303,7 +303,7 @@
           <w:p>
             <w:pPr>
               <w:bidi/>
-              <w:jc w:val="right"/>
+              <w:jc w:val="left"/>
             </w:pPr>
             <w:r>
               <w:rPr>
@@ -323,7 +323,7 @@
           <w:p>
             <w:pPr>
               <w:bidi/>
-              <w:jc w:val="right"/>
+              <w:jc w:val="left"/>
             </w:pPr>
             <w:r>
               <w:rPr>
@@ -345,7 +345,7 @@
           <w:p>
             <w:pPr>
               <w:bidi/>
-              <w:jc w:val="right"/>
+              <w:jc w:val="left"/>
             </w:pPr>
             <w:r>
               <w:rPr>
@@ -365,7 +365,7 @@
           <w:p>
             <w:pPr>
               <w:bidi/>
-              <w:jc w:val="right"/>
+              <w:jc w:val="left"/>
             </w:pPr>
             <w:r>
               <w:rPr>
@@ -385,7 +385,7 @@
           <w:p>
             <w:pPr>
               <w:bidi/>
-              <w:jc w:val="right"/>
+              <w:jc w:val="left"/>
             </w:pPr>
             <w:r>
               <w:rPr>
@@ -405,7 +405,7 @@
           <w:p>
             <w:pPr>
               <w:bidi/>
-              <w:jc w:val="right"/>
+              <w:jc w:val="left"/>
             </w:pPr>
             <w:r>
               <w:rPr>
@@ -427,7 +427,7 @@
           <w:p>
             <w:pPr>
               <w:bidi/>
-              <w:jc w:val="right"/>
+              <w:jc w:val="left"/>
             </w:pPr>
             <w:r>
               <w:rPr>
@@ -447,7 +447,7 @@
           <w:p>
             <w:pPr>
               <w:bidi/>
-              <w:jc w:val="right"/>
+              <w:jc w:val="left"/>
             </w:pPr>
             <w:r>
               <w:rPr>
@@ -467,7 +467,7 @@
           <w:p>
             <w:pPr>
               <w:bidi/>
-              <w:jc w:val="right"/>
+              <w:jc w:val="left"/>
             </w:pPr>
             <w:r>
               <w:rPr>
@@ -487,7 +487,7 @@
           <w:p>
             <w:pPr>
               <w:bidi/>
-              <w:jc w:val="right"/>
+              <w:jc w:val="left"/>
             </w:pPr>
             <w:r>
               <w:rPr>
@@ -509,7 +509,7 @@
           <w:p>
             <w:pPr>
               <w:bidi/>
-              <w:jc w:val="right"/>
+              <w:jc w:val="left"/>
             </w:pPr>
             <w:r>
               <w:rPr>
@@ -529,7 +529,7 @@
           <w:p>
             <w:pPr>
               <w:bidi/>
-              <w:jc w:val="right"/>
+              <w:jc w:val="left"/>
             </w:pPr>
             <w:r>
               <w:rPr>
@@ -549,7 +549,7 @@
           <w:p>
             <w:pPr>
               <w:bidi/>
-              <w:jc w:val="right"/>
+              <w:jc w:val="left"/>
             </w:pPr>
             <w:r>
               <w:rPr>
@@ -569,7 +569,7 @@
           <w:p>
             <w:pPr>
               <w:bidi/>
-              <w:jc w:val="right"/>
+              <w:jc w:val="left"/>
             </w:pPr>
             <w:r>
               <w:rPr>
@@ -591,7 +591,7 @@
           <w:p>
             <w:pPr>
               <w:bidi/>
-              <w:jc w:val="right"/>
+              <w:jc w:val="left"/>
             </w:pPr>
             <w:r>
               <w:rPr>
@@ -611,7 +611,7 @@
           <w:p>
             <w:pPr>
               <w:bidi/>
-              <w:jc w:val="right"/>
+              <w:jc w:val="left"/>
             </w:pPr>
             <w:r>
               <w:rPr>
@@ -631,7 +631,7 @@
           <w:p>
             <w:pPr>
               <w:bidi/>
-              <w:jc w:val="right"/>
+              <w:jc w:val="left"/>
             </w:pPr>
             <w:r>
               <w:rPr>
@@ -651,7 +651,7 @@
           <w:p>
             <w:pPr>
               <w:bidi/>
-              <w:jc w:val="right"/>
+              <w:jc w:val="left"/>
             </w:pPr>
             <w:r>
               <w:rPr>
@@ -673,7 +673,7 @@
           <w:p>
             <w:pPr>
               <w:bidi/>
-              <w:jc w:val="right"/>
+              <w:jc w:val="left"/>
             </w:pPr>
             <w:r>
               <w:rPr>
@@ -693,7 +693,7 @@
           <w:p>
             <w:pPr>
               <w:bidi/>
-              <w:jc w:val="right"/>
+              <w:jc w:val="left"/>
             </w:pPr>
             <w:r>
               <w:rPr>
@@ -713,7 +713,7 @@
           <w:p>
             <w:pPr>
               <w:bidi/>
-              <w:jc w:val="right"/>
+              <w:jc w:val="left"/>
             </w:pPr>
             <w:r>
               <w:rPr>
@@ -733,7 +733,7 @@
           <w:p>
             <w:pPr>
               <w:bidi/>
-              <w:jc w:val="right"/>
+              <w:jc w:val="left"/>
             </w:pPr>
             <w:r>
               <w:rPr>
@@ -755,7 +755,7 @@
           <w:p>
             <w:pPr>
               <w:bidi/>
-              <w:jc w:val="right"/>
+              <w:jc w:val="left"/>
             </w:pPr>
             <w:r>
               <w:rPr>
@@ -775,7 +775,7 @@
           <w:p>
             <w:pPr>
               <w:bidi/>
-              <w:jc w:val="right"/>
+              <w:jc w:val="left"/>
             </w:pPr>
             <w:r>
               <w:rPr>
@@ -795,7 +795,7 @@
           <w:p>
             <w:pPr>
               <w:bidi/>
-              <w:jc w:val="right"/>
+              <w:jc w:val="left"/>
             </w:pPr>
             <w:r>
               <w:rPr>
@@ -815,7 +815,7 @@
           <w:p>
             <w:pPr>
               <w:bidi/>
-              <w:jc w:val="right"/>
+              <w:jc w:val="left"/>
             </w:pPr>
             <w:r>
               <w:rPr>
@@ -837,7 +837,7 @@
           <w:p>
             <w:pPr>
               <w:bidi/>
-              <w:jc w:val="right"/>
+              <w:jc w:val="left"/>
             </w:pPr>
             <w:r>
               <w:rPr>
@@ -857,7 +857,7 @@
           <w:p>
             <w:pPr>
               <w:bidi/>
-              <w:jc w:val="right"/>
+              <w:jc w:val="left"/>
             </w:pPr>
             <w:r>
               <w:rPr>
@@ -877,7 +877,7 @@
           <w:p>
             <w:pPr>
               <w:bidi/>
-              <w:jc w:val="right"/>
+              <w:jc w:val="left"/>
             </w:pPr>
             <w:r>
               <w:rPr>
@@ -897,7 +897,7 @@
           <w:p>
             <w:pPr>
               <w:bidi/>
-              <w:jc w:val="right"/>
+              <w:jc w:val="left"/>
             </w:pPr>
             <w:r>
               <w:rPr>
@@ -922,7 +922,7 @@
         <w:keepNext/>
         <w:bidi/>
         <w:spacing w:after="160" w:before="280"/>
-        <w:jc w:val="right"/>
+        <w:jc w:val="left"/>
       </w:pPr>
       <w:r>
         <w:rPr>
@@ -942,7 +942,7 @@
         <w:bidi/>
         <w:spacing w:after="60"/>
         <w:ind w:right="227"/>
-        <w:jc w:val="right"/>
+        <w:jc w:val="left"/>
       </w:pPr>
       <w:r>
         <w:rPr>
@@ -960,7 +960,7 @@
         <w:bidi/>
         <w:spacing w:after="60"/>
         <w:ind w:right="227"/>
-        <w:jc w:val="right"/>
+        <w:jc w:val="left"/>
       </w:pPr>
       <w:r>
         <w:rPr>
@@ -978,7 +978,7 @@
         <w:bidi/>
         <w:spacing w:after="60"/>
         <w:ind w:right="227"/>
-        <w:jc w:val="right"/>
+        <w:jc w:val="left"/>
       </w:pPr>
       <w:r>
         <w:rPr>
@@ -996,7 +996,7 @@
         <w:bidi/>
         <w:spacing w:after="60"/>
         <w:ind w:right="227"/>
-        <w:jc w:val="right"/>
+        <w:jc w:val="left"/>
       </w:pPr>
       <w:r>
         <w:rPr>
@@ -1014,7 +1014,7 @@
         <w:bidi/>
         <w:spacing w:after="60"/>
         <w:ind w:right="227"/>
-        <w:jc w:val="right"/>
+        <w:jc w:val="left"/>
       </w:pPr>
       <w:r>
         <w:rPr>
@@ -1046,7 +1046,7 @@
           <w:p>
             <w:pPr>
               <w:bidi/>
-              <w:jc w:val="right"/>
+              <w:jc w:val="left"/>
             </w:pPr>
             <w:r>
               <w:rPr>
@@ -1082,7 +1082,7 @@
         <w:keepNext/>
         <w:bidi/>
         <w:spacing w:after="160" w:before="280"/>
-        <w:jc w:val="right"/>
+        <w:jc w:val="left"/>
       </w:pPr>
       <w:r>
         <w:rPr>
@@ -1102,7 +1102,7 @@
         <w:bidi/>
         <w:spacing w:after="60"/>
         <w:ind w:right="227"/>
-        <w:jc w:val="right"/>
+        <w:jc w:val="left"/>
       </w:pPr>
       <w:r>
         <w:rPr>
@@ -1120,7 +1120,7 @@
         <w:bidi/>
         <w:spacing w:after="60"/>
         <w:ind w:right="227"/>
-        <w:jc w:val="right"/>
+        <w:jc w:val="left"/>
       </w:pPr>
       <w:r>
         <w:rPr>
@@ -1138,7 +1138,7 @@
         <w:bidi/>
         <w:spacing w:after="60"/>
         <w:ind w:right="227"/>
-        <w:jc w:val="right"/>
+        <w:jc w:val="left"/>
       </w:pPr>
       <w:r>
         <w:rPr>
@@ -1156,7 +1156,7 @@
         <w:bidi/>
         <w:spacing w:after="60"/>
         <w:ind w:right="227"/>
-        <w:jc w:val="right"/>
+        <w:jc w:val="left"/>
       </w:pPr>
       <w:r>
         <w:rPr>
@@ -1174,7 +1174,7 @@
         <w:bidi/>
         <w:spacing w:after="60"/>
         <w:ind w:right="227"/>
-        <w:jc w:val="right"/>
+        <w:jc w:val="left"/>
       </w:pPr>
       <w:r>
         <w:rPr>
@@ -1192,7 +1192,7 @@
         <w:bidi/>
         <w:spacing w:after="60"/>
         <w:ind w:right="227"/>
-        <w:jc w:val="right"/>
+        <w:jc w:val="left"/>
       </w:pPr>
       <w:r>
         <w:rPr>
@@ -1210,7 +1210,7 @@
         <w:bidi/>
         <w:spacing w:after="60"/>
         <w:ind w:right="227"/>
-        <w:jc w:val="right"/>
+        <w:jc w:val="left"/>
       </w:pPr>
       <w:r>
         <w:rPr>
@@ -1228,7 +1228,7 @@
         <w:keepNext/>
         <w:bidi/>
         <w:spacing w:after="160" w:before="280"/>
-        <w:jc w:val="right"/>
+        <w:jc w:val="left"/>
       </w:pPr>
       <w:r>
         <w:rPr>
@@ -1267,7 +1267,7 @@
           <w:p>
             <w:pPr>
               <w:bidi/>
-              <w:jc w:val="right"/>
+              <w:jc w:val="left"/>
             </w:pPr>
             <w:r>
               <w:rPr>
@@ -1291,7 +1291,7 @@
           <w:p>
             <w:pPr>
               <w:bidi/>
-              <w:jc w:val="right"/>
+              <w:jc w:val="left"/>
             </w:pPr>
             <w:r>
               <w:rPr>
@@ -1315,7 +1315,7 @@
           <w:p>
             <w:pPr>
               <w:bidi/>
-              <w:jc w:val="right"/>
+              <w:jc w:val="left"/>
             </w:pPr>
             <w:r>
               <w:rPr>
@@ -1340,7 +1340,7 @@
           <w:p>
             <w:pPr>
               <w:bidi/>
-              <w:jc w:val="right"/>
+              <w:jc w:val="left"/>
             </w:pPr>
             <w:r>
               <w:rPr>
@@ -1360,7 +1360,7 @@
           <w:p>
             <w:pPr>
               <w:bidi/>
-              <w:jc w:val="right"/>
+              <w:jc w:val="left"/>
             </w:pPr>
             <w:r>
               <w:rPr>
@@ -1380,7 +1380,7 @@
           <w:p>
             <w:pPr>
               <w:bidi/>
-              <w:jc w:val="right"/>
+              <w:jc w:val="left"/>
             </w:pPr>
             <w:r>
               <w:rPr>
@@ -1402,7 +1402,7 @@
           <w:p>
             <w:pPr>
               <w:bidi/>
-              <w:jc w:val="right"/>
+              <w:jc w:val="left"/>
             </w:pPr>
             <w:r>
               <w:rPr>
@@ -1422,7 +1422,7 @@
           <w:p>
             <w:pPr>
               <w:bidi/>
-              <w:jc w:val="right"/>
+              <w:jc w:val="left"/>
             </w:pPr>
             <w:r>
               <w:rPr>
@@ -1442,7 +1442,7 @@
           <w:p>
             <w:pPr>
               <w:bidi/>
-              <w:jc w:val="right"/>
+              <w:jc w:val="left"/>
             </w:pPr>
             <w:r>
               <w:rPr>
@@ -1464,7 +1464,7 @@
           <w:p>
             <w:pPr>
               <w:bidi/>
-              <w:jc w:val="right"/>
+              <w:jc w:val="left"/>
             </w:pPr>
             <w:r>
               <w:rPr>
@@ -1484,7 +1484,7 @@
           <w:p>
             <w:pPr>
               <w:bidi/>
-              <w:jc w:val="right"/>
+              <w:jc w:val="left"/>
             </w:pPr>
             <w:r>
               <w:rPr>
@@ -1504,7 +1504,7 @@
           <w:p>
             <w:pPr>
               <w:bidi/>
-              <w:jc w:val="right"/>
+              <w:jc w:val="left"/>
             </w:pPr>
             <w:r>
               <w:rPr>
@@ -1526,7 +1526,7 @@
           <w:p>
             <w:pPr>
               <w:bidi/>
-              <w:jc w:val="right"/>
+              <w:jc w:val="left"/>
             </w:pPr>
             <w:r>
               <w:rPr>
@@ -1546,7 +1546,7 @@
           <w:p>
             <w:pPr>
               <w:bidi/>
-              <w:jc w:val="right"/>
+              <w:jc w:val="left"/>
             </w:pPr>
             <w:r>
               <w:rPr>
@@ -1566,7 +1566,7 @@
           <w:p>
             <w:pPr>
               <w:bidi/>
-              <w:jc w:val="right"/>
+              <w:jc w:val="left"/>
             </w:pPr>
             <w:r>
               <w:rPr>
@@ -1588,7 +1588,7 @@
           <w:p>
             <w:pPr>
               <w:bidi/>
-              <w:jc w:val="right"/>
+              <w:jc w:val="left"/>
             </w:pPr>
             <w:r>
               <w:rPr>
@@ -1608,7 +1608,7 @@
           <w:p>
             <w:pPr>
               <w:bidi/>
-              <w:jc w:val="right"/>
+              <w:jc w:val="left"/>
             </w:pPr>
             <w:r>
               <w:rPr>
@@ -1628,7 +1628,7 @@
           <w:p>
             <w:pPr>
               <w:bidi/>
-              <w:jc w:val="right"/>
+              <w:jc w:val="left"/>
             </w:pPr>
             <w:r>
               <w:rPr>
@@ -1650,7 +1650,7 @@
           <w:p>
             <w:pPr>
               <w:bidi/>
-              <w:jc w:val="right"/>
+              <w:jc w:val="left"/>
             </w:pPr>
             <w:r>
               <w:rPr>
@@ -1670,7 +1670,7 @@
           <w:p>
             <w:pPr>
               <w:bidi/>
-              <w:jc w:val="right"/>
+              <w:jc w:val="left"/>
             </w:pPr>
             <w:r>
               <w:rPr>
@@ -1690,7 +1690,7 @@
           <w:p>
             <w:pPr>
               <w:bidi/>
-              <w:jc w:val="right"/>
+              <w:jc w:val="left"/>
             </w:pPr>
             <w:r>
               <w:rPr>
@@ -1715,7 +1715,7 @@
         <w:keepNext/>
         <w:bidi/>
         <w:spacing w:after="160" w:before="280"/>
-        <w:jc w:val="right"/>
+        <w:jc w:val="left"/>
       </w:pPr>
       <w:r>
         <w:rPr>
@@ -1753,7 +1753,7 @@
           <w:p>
             <w:pPr>
               <w:bidi/>
-              <w:jc w:val="right"/>
+              <w:jc w:val="left"/>
             </w:pPr>
             <w:r>
               <w:rPr>
@@ -1777,7 +1777,7 @@
           <w:p>
             <w:pPr>
               <w:bidi/>
-              <w:jc w:val="right"/>
+              <w:jc w:val="left"/>
             </w:pPr>
             <w:r>
               <w:rPr>
@@ -1802,7 +1802,7 @@
           <w:p>
             <w:pPr>
               <w:bidi/>
-              <w:jc w:val="right"/>
+              <w:jc w:val="left"/>
             </w:pPr>
             <w:r>
               <w:rPr>
@@ -1822,7 +1822,7 @@
           <w:p>
             <w:pPr>
               <w:bidi/>
-              <w:jc w:val="right"/>
+              <w:jc w:val="left"/>
             </w:pPr>
             <w:r>
               <w:rPr>
@@ -1844,7 +1844,7 @@
           <w:p>
             <w:pPr>
               <w:bidi/>
-              <w:jc w:val="right"/>
+              <w:jc w:val="left"/>
             </w:pPr>
             <w:r>
               <w:rPr>
@@ -1864,7 +1864,7 @@
           <w:p>
             <w:pPr>
               <w:bidi/>
-              <w:jc w:val="right"/>
+              <w:jc w:val="left"/>
             </w:pPr>
             <w:r>
               <w:rPr>
@@ -1886,7 +1886,7 @@
           <w:p>
             <w:pPr>
               <w:bidi/>
-              <w:jc w:val="right"/>
+              <w:jc w:val="left"/>
             </w:pPr>
             <w:r>
               <w:rPr>
@@ -1906,7 +1906,7 @@
           <w:p>
             <w:pPr>
               <w:bidi/>
-              <w:jc w:val="right"/>
+              <w:jc w:val="left"/>
             </w:pPr>
             <w:r>
               <w:rPr>
@@ -1931,7 +1931,7 @@
         <w:keepNext/>
         <w:bidi/>
         <w:spacing w:after="160" w:before="280"/>
-        <w:jc w:val="right"/>
+        <w:jc w:val="left"/>
       </w:pPr>
       <w:r>
         <w:rPr>
@@ -1951,7 +1951,7 @@
         <w:bidi/>
         <w:spacing w:after="60"/>
         <w:ind w:right="227"/>
-        <w:jc w:val="right"/>
+        <w:jc w:val="left"/>
       </w:pPr>
       <w:r>
         <w:rPr>
@@ -1969,7 +1969,7 @@
         <w:bidi/>
         <w:spacing w:after="60"/>
         <w:ind w:right="227"/>
-        <w:jc w:val="right"/>
+        <w:jc w:val="left"/>
       </w:pPr>
       <w:r>
         <w:rPr>
@@ -1987,7 +1987,7 @@
         <w:bidi/>
         <w:spacing w:after="60"/>
         <w:ind w:right="227"/>
-        <w:jc w:val="right"/>
+        <w:jc w:val="left"/>
       </w:pPr>
       <w:r>
         <w:rPr>
@@ -2005,7 +2005,7 @@
         <w:bidi/>
         <w:spacing w:after="60"/>
         <w:ind w:right="227"/>
-        <w:jc w:val="right"/>
+        <w:jc w:val="left"/>
       </w:pPr>
       <w:r>
         <w:rPr>
@@ -2023,7 +2023,7 @@
         <w:bidi/>
         <w:spacing w:after="60"/>
         <w:ind w:right="227"/>
-        <w:jc w:val="right"/>
+        <w:jc w:val="left"/>
       </w:pPr>
       <w:r>
         <w:rPr>
@@ -2041,7 +2041,7 @@
         <w:keepNext/>
         <w:bidi/>
         <w:spacing w:after="160" w:before="280"/>
-        <w:jc w:val="right"/>
+        <w:jc w:val="left"/>
       </w:pPr>
       <w:r>
         <w:rPr>
@@ -2061,7 +2061,7 @@
         <w:bidi/>
         <w:spacing w:after="60"/>
         <w:ind w:right="227"/>
-        <w:jc w:val="right"/>
+        <w:jc w:val="left"/>
       </w:pPr>
       <w:r>
         <w:rPr>
@@ -2079,7 +2079,7 @@
         <w:bidi/>
         <w:spacing w:after="60"/>
         <w:ind w:right="227"/>
-        <w:jc w:val="right"/>
+        <w:jc w:val="left"/>
       </w:pPr>
       <w:r>
         <w:rPr>
@@ -2097,7 +2097,7 @@
         <w:bidi/>
         <w:spacing w:after="60"/>
         <w:ind w:right="227"/>
-        <w:jc w:val="right"/>
+        <w:jc w:val="left"/>
       </w:pPr>
       <w:r>
         <w:rPr>
@@ -2115,7 +2115,7 @@
         <w:bidi/>
         <w:spacing w:after="60"/>
         <w:ind w:right="227"/>
-        <w:jc w:val="right"/>
+        <w:jc w:val="left"/>
       </w:pPr>
       <w:r>
         <w:rPr>

</xml_diff>